<commit_message>
Criação dos modelos de relatório de estágio, e de contrato
</commit_message>
<xml_diff>
--- a/src/Estagio/media/modelos/RelatorioFinalCLTSOCIO.docx
+++ b/src/Estagio/media/modelos/RelatorioFinalCLTSOCIO.docx
@@ -644,13 +644,7 @@
               <w:fldChar w:fldCharType="separate"/>
             </w:r>
             <w:r>
-              <w:t>{{ telefone</w:t>
-            </w:r>
-            <w:r>
-              <w:t>_1</w:t>
-            </w:r>
-            <w:r>
-              <w:t xml:space="preserve"> }}</w:t>
+              <w:t>{{ telefone_1 }}</w:t>
             </w:r>
             <w:r>
               <w:rPr>
@@ -734,13 +728,7 @@
               <w:fldChar w:fldCharType="separate"/>
             </w:r>
             <w:r>
-              <w:t xml:space="preserve">{{ </w:t>
-            </w:r>
-            <w:r>
-              <w:t>telefone_2</w:t>
-            </w:r>
-            <w:r>
-              <w:t xml:space="preserve"> }}</w:t>
+              <w:t xml:space="preserve">{{ telefone_2 }}</w:t>
             </w:r>
             <w:r>
               <w:rPr>
@@ -856,13 +844,7 @@
               <w:fldChar w:fldCharType="separate"/>
             </w:r>
             <w:r>
-              <w:t>{{ email</w:t>
-            </w:r>
-            <w:r>
-              <w:t>_1</w:t>
-            </w:r>
-            <w:r>
-              <w:t xml:space="preserve"> }}</w:t>
+              <w:t>{{ email_1 }}</w:t>
             </w:r>
             <w:r>
               <w:rPr>
@@ -946,13 +928,7 @@
               <w:fldChar w:fldCharType="separate"/>
             </w:r>
             <w:r>
-              <w:t>{{ email</w:t>
-            </w:r>
-            <w:r>
-              <w:t>_2</w:t>
-            </w:r>
-            <w:r>
-              <w:t xml:space="preserve"> }}</w:t>
+              <w:t>{{ email_2 }}</w:t>
             </w:r>
             <w:r>
               <w:rPr>
@@ -1180,14 +1156,7 @@
               <w:rPr>
                 <w:lang w:val="pt-BR"/>
               </w:rPr>
-              <w:t>{{ segmento</w:t>
-            </w:r>
-            <w:proofErr w:type="gramEnd"/>
-            <w:r>
-              <w:rPr>
-                <w:lang w:val="pt-BR"/>
-              </w:rPr>
-              <w:t xml:space="preserve"> }}</w:t>
+              <w:t>{{ segmento }}</w:t>
             </w:r>
             <w:r>
               <w:rPr>
@@ -1302,28 +1271,7 @@
               <w:rPr>
                 <w:lang w:val="pt-BR"/>
               </w:rPr>
-              <w:t xml:space="preserve">{{ </w:t>
-            </w:r>
-            <w:proofErr w:type="spellStart"/>
-            <w:r>
-              <w:rPr>
-                <w:lang w:val="pt-BR"/>
-              </w:rPr>
-              <w:t>area</w:t>
-            </w:r>
-            <w:proofErr w:type="gramEnd"/>
-            <w:r>
-              <w:rPr>
-                <w:lang w:val="pt-BR"/>
-              </w:rPr>
-              <w:t>_atuacao</w:t>
-            </w:r>
-            <w:proofErr w:type="spellEnd"/>
-            <w:r>
-              <w:rPr>
-                <w:lang w:val="pt-BR"/>
-              </w:rPr>
-              <w:t xml:space="preserve"> }}</w:t>
+              <w:t xml:space="preserve">{{ area_atuacao }}</w:t>
             </w:r>
             <w:r>
               <w:rPr>
@@ -1470,28 +1418,7 @@
               <w:rPr>
                 <w:lang w:val="pt-BR"/>
               </w:rPr>
-              <w:t xml:space="preserve">{{ </w:t>
-            </w:r>
-            <w:proofErr w:type="spellStart"/>
-            <w:r>
-              <w:rPr>
-                <w:lang w:val="pt-BR"/>
-              </w:rPr>
-              <w:t>gestor</w:t>
-            </w:r>
-            <w:proofErr w:type="gramEnd"/>
-            <w:r>
-              <w:rPr>
-                <w:lang w:val="pt-BR"/>
-              </w:rPr>
-              <w:t>_nome</w:t>
-            </w:r>
-            <w:proofErr w:type="spellEnd"/>
-            <w:r>
-              <w:rPr>
-                <w:lang w:val="pt-BR"/>
-              </w:rPr>
-              <w:t xml:space="preserve"> }}</w:t>
+              <w:t xml:space="preserve">{{ gestor_nome }}</w:t>
             </w:r>
             <w:r>
               <w:rPr>
@@ -1681,343 +1608,7 @@
               <w:rPr>
                 <w:lang w:val="pt-BR"/>
               </w:rPr>
-              <w:t xml:space="preserve">{{ </w:t>
-            </w:r>
-            <w:proofErr w:type="spellStart"/>
-            <w:r>
-              <w:rPr>
-                <w:lang w:val="pt-BR"/>
-              </w:rPr>
-              <w:t>gestor</w:t>
-            </w:r>
-            <w:proofErr w:type="gramEnd"/>
-            <w:r>
-              <w:rPr>
-                <w:lang w:val="pt-BR"/>
-              </w:rPr>
-              <w:t>_</w:t>
-            </w:r>
-            <w:proofErr w:type="gramStart"/>
-            <w:r>
-              <w:rPr>
-                <w:lang w:val="pt-BR"/>
-              </w:rPr>
-              <w:t>telefone</w:t>
-            </w:r>
-            <w:proofErr w:type="spellEnd"/>
-            <w:r>
-              <w:rPr>
-                <w:lang w:val="pt-BR"/>
-              </w:rPr>
-              <w:t xml:space="preserve"> }</w:t>
-            </w:r>
-            <w:proofErr w:type="gramEnd"/>
-            <w:r>
-              <w:rPr>
-                <w:lang w:val="pt-BR"/>
-              </w:rPr>
-              <w:t>}</w:t>
-            </w:r>
-          </w:p>
-          <w:p>
-            <w:pPr>
-              <w:pStyle w:val="Ttulo"/>
-              <w:jc w:val="both"/>
-              <w:rPr>
-                <w:rFonts w:ascii="Open Sans" w:hAnsi="Open Sans" w:cs="Open Sans"/>
-                <w:b w:val="0"/>
-                <w:bCs w:val="0"/>
-                <w:sz w:val="22"/>
-                <w:szCs w:val="22"/>
-                <w:lang w:val="pt-BR"/>
-              </w:rPr>
-            </w:pPr>
-            <w:r>
-              <w:rPr>
-                <w:rFonts w:ascii="Open Sans" w:hAnsi="Open Sans" w:cs="Open Sans"/>
-                <w:b w:val="0"/>
-                <w:bCs w:val="0"/>
-                <w:sz w:val="22"/>
-                <w:szCs w:val="22"/>
-                <w:lang w:val="pt-BR"/>
-              </w:rPr>
-              <w:fldChar w:fldCharType="end"/>
-            </w:r>
-            <w:bookmarkEnd w:id="11"/>
-          </w:p>
-        </w:tc>
-      </w:tr>
-    </w:tbl>
-    <w:p>
-      <w:pPr>
-        <w:rPr>
-          <w:rFonts w:ascii="Open Sans" w:hAnsi="Open Sans" w:cs="Open Sans"/>
-          <w:lang w:val="pt-BR"/>
-        </w:rPr>
-      </w:pPr>
-    </w:p>
-    <w:tbl>
-      <w:tblPr>
-        <w:tblW w:w="10800" w:type="dxa"/>
-        <w:tblInd w:w="-252" w:type="dxa"/>
-        <w:tblBorders>
-          <w:top w:val="single" w:sz="4" w:space="0" w:color="auto"/>
-          <w:left w:val="single" w:sz="4" w:space="0" w:color="auto"/>
-          <w:bottom w:val="single" w:sz="4" w:space="0" w:color="auto"/>
-          <w:right w:val="single" w:sz="4" w:space="0" w:color="auto"/>
-          <w:insideH w:val="single" w:sz="4" w:space="0" w:color="auto"/>
-          <w:insideV w:val="single" w:sz="4" w:space="0" w:color="auto"/>
-        </w:tblBorders>
-        <w:tblLayout w:type="fixed"/>
-        <w:tblLook w:val="0000" w:firstRow="0" w:lastRow="0" w:firstColumn="0" w:lastColumn="0" w:noHBand="0" w:noVBand="0"/>
-      </w:tblPr>
-      <w:tblGrid>
-        <w:gridCol w:w="10800"/>
-      </w:tblGrid>
-      <w:tr>
-        <w:tblPrEx>
-          <w:tblCellMar>
-            <w:top w:w="0" w:type="dxa"/>
-            <w:bottom w:w="0" w:type="dxa"/>
-          </w:tblCellMar>
-        </w:tblPrEx>
-        <w:trPr>
-          <w:cantSplit/>
-        </w:trPr>
-        <w:tc>
-          <w:tcPr>
-            <w:tcW w:w="10800" w:type="dxa"/>
-          </w:tcPr>
-          <w:p>
-            <w:pPr>
-              <w:pStyle w:val="Ttulo"/>
-              <w:shd w:val="clear" w:color="auto" w:fill="CC9900"/>
-              <w:rPr>
-                <w:rFonts w:ascii="Open Sans" w:hAnsi="Open Sans" w:cs="Open Sans"/>
-                <w:b w:val="0"/>
-                <w:bCs w:val="0"/>
-                <w:color w:val="333399"/>
-              </w:rPr>
-            </w:pPr>
-            <w:r>
-              <w:rPr>
-                <w:rFonts w:ascii="Open Sans" w:hAnsi="Open Sans" w:cs="Open Sans"/>
-                <w:b w:val="0"/>
-                <w:bCs w:val="0"/>
-                <w:color w:val="333399"/>
-                <w:sz w:val="28"/>
-                <w:szCs w:val="28"/>
-              </w:rPr>
-              <w:br w:type="page"/>
-            </w:r>
-          </w:p>
-          <w:p>
-            <w:pPr>
-              <w:pStyle w:val="Ttulo"/>
-              <w:shd w:val="clear" w:color="auto" w:fill="CC9900"/>
-              <w:rPr>
-                <w:rFonts w:ascii="Open Sans" w:hAnsi="Open Sans" w:cs="Open Sans"/>
-                <w:sz w:val="28"/>
-                <w:szCs w:val="28"/>
-                <w:lang w:val="pt-BR"/>
-              </w:rPr>
-            </w:pPr>
-            <w:r>
-              <w:rPr>
-                <w:rFonts w:ascii="Open Sans" w:hAnsi="Open Sans" w:cs="Open Sans"/>
-                <w:sz w:val="28"/>
-                <w:szCs w:val="28"/>
-                <w:lang w:val="pt-BR"/>
-              </w:rPr>
-              <w:t>AVALIAÇÃO GERAL DO ALUNO</w:t>
-            </w:r>
-          </w:p>
-          <w:p>
-            <w:pPr>
-              <w:pStyle w:val="Ttulo"/>
-              <w:shd w:val="clear" w:color="auto" w:fill="CC9900"/>
-              <w:rPr>
-                <w:rFonts w:ascii="Open Sans" w:hAnsi="Open Sans" w:cs="Open Sans"/>
-                <w:color w:val="333399"/>
-                <w:lang w:val="pt-BR"/>
-              </w:rPr>
-            </w:pPr>
-          </w:p>
-        </w:tc>
-      </w:tr>
-      <w:tr>
-        <w:tblPrEx>
-          <w:tblCellMar>
-            <w:top w:w="0" w:type="dxa"/>
-            <w:bottom w:w="0" w:type="dxa"/>
-          </w:tblCellMar>
-        </w:tblPrEx>
-        <w:trPr>
-          <w:cantSplit/>
-          <w:trHeight w:val="1477"/>
-        </w:trPr>
-        <w:tc>
-          <w:tcPr>
-            <w:tcW w:w="10800" w:type="dxa"/>
-            <w:tcBorders>
-              <w:bottom w:val="single" w:sz="4" w:space="0" w:color="auto"/>
-            </w:tcBorders>
-          </w:tcPr>
-          <w:p>
-            <w:pPr>
-              <w:pStyle w:val="Ttulo"/>
-              <w:jc w:val="both"/>
-              <w:outlineLvl w:val="0"/>
-              <w:rPr>
-                <w:rFonts w:ascii="Open Sans" w:hAnsi="Open Sans" w:cs="Open Sans"/>
-                <w:sz w:val="22"/>
-                <w:lang w:val="pt-BR"/>
-              </w:rPr>
-            </w:pPr>
-            <w:r>
-              <w:rPr>
-                <w:rFonts w:ascii="Open Sans" w:hAnsi="Open Sans" w:cs="Open Sans"/>
-                <w:sz w:val="22"/>
-                <w:lang w:val="pt-BR"/>
-              </w:rPr>
-              <w:t>Quais foram</w:t>
-            </w:r>
-            <w:r>
-              <w:rPr>
-                <w:rFonts w:ascii="Open Sans" w:hAnsi="Open Sans" w:cs="Open Sans"/>
-                <w:sz w:val="22"/>
-                <w:lang w:val="pt-BR"/>
-              </w:rPr>
-              <w:t xml:space="preserve"> as principais contribuições da sua formação acadêmica para a realização das suas </w:t>
-            </w:r>
-            <w:r>
-              <w:rPr>
-                <w:rFonts w:ascii="Open Sans" w:hAnsi="Open Sans" w:cs="Open Sans"/>
-                <w:sz w:val="22"/>
-                <w:lang w:val="pt-BR"/>
-              </w:rPr>
-              <w:t xml:space="preserve">atividades </w:t>
-            </w:r>
-            <w:r>
-              <w:rPr>
-                <w:rFonts w:ascii="Open Sans" w:hAnsi="Open Sans" w:cs="Open Sans"/>
-                <w:sz w:val="22"/>
-                <w:lang w:val="pt-BR"/>
-              </w:rPr>
-              <w:t>profissionais</w:t>
-            </w:r>
-            <w:r>
-              <w:rPr>
-                <w:rFonts w:ascii="Open Sans" w:hAnsi="Open Sans" w:cs="Open Sans"/>
-                <w:sz w:val="22"/>
-                <w:lang w:val="pt-BR"/>
-              </w:rPr>
-              <w:t xml:space="preserve"> desenvolvidas</w:t>
-            </w:r>
-            <w:r>
-              <w:rPr>
-                <w:rFonts w:ascii="Open Sans" w:hAnsi="Open Sans" w:cs="Open Sans"/>
-                <w:sz w:val="22"/>
-                <w:lang w:val="pt-BR"/>
-              </w:rPr>
-              <w:t>? Comente.</w:t>
-            </w:r>
-          </w:p>
-          <w:p>
-            <w:pPr>
-              <w:pStyle w:val="Ttulo"/>
-              <w:jc w:val="both"/>
-              <w:outlineLvl w:val="0"/>
-              <w:rPr>
-                <w:rFonts w:ascii="Open Sans" w:hAnsi="Open Sans" w:cs="Open Sans"/>
-                <w:color w:val="333399"/>
-                <w:sz w:val="22"/>
-                <w:lang w:val="pt-BR"/>
-              </w:rPr>
-            </w:pPr>
-          </w:p>
-          <w:p>
-            <w:pPr>
-              <w:pStyle w:val="Ttulo"/>
-              <w:jc w:val="both"/>
-              <w:outlineLvl w:val="0"/>
-              <w:rPr>
-                <w:rFonts w:ascii="Open Sans" w:hAnsi="Open Sans" w:cs="Open Sans"/>
-                <w:color w:val="333399"/>
-                <w:sz w:val="22"/>
-                <w:lang w:val="pt-BR"/>
-              </w:rPr>
-            </w:pPr>
-            <w:r>
-              <w:rPr>
-                <w:rFonts w:ascii="Open Sans" w:hAnsi="Open Sans" w:cs="Open Sans"/>
-                <w:color w:val="333399"/>
-                <w:sz w:val="22"/>
-                <w:lang w:val="pt-BR"/>
-              </w:rPr>
-              <w:fldChar w:fldCharType="begin">
-                <w:ffData>
-                  <w:name w:val="Texto11"/>
-                  <w:enabled/>
-                  <w:calcOnExit w:val="0"/>
-                  <w:textInput/>
-                </w:ffData>
-              </w:fldChar>
-            </w:r>
-            <w:bookmarkStart w:id="12" w:name="Texto11"/>
-            <w:r>
-              <w:rPr>
-                <w:rFonts w:ascii="Open Sans" w:hAnsi="Open Sans" w:cs="Open Sans"/>
-                <w:color w:val="333399"/>
-                <w:sz w:val="22"/>
-                <w:lang w:val="pt-BR"/>
-              </w:rPr>
-              <w:instrText xml:space="preserve"> FORMTEXT </w:instrText>
-            </w:r>
-            <w:r>
-              <w:rPr>
-                <w:rFonts w:ascii="Open Sans" w:hAnsi="Open Sans" w:cs="Open Sans"/>
-                <w:color w:val="333399"/>
-                <w:sz w:val="22"/>
-                <w:lang w:val="pt-BR"/>
-              </w:rPr>
-            </w:r>
-            <w:r>
-              <w:rPr>
-                <w:rFonts w:ascii="Open Sans" w:hAnsi="Open Sans" w:cs="Open Sans"/>
-                <w:color w:val="333399"/>
-                <w:sz w:val="22"/>
-                <w:lang w:val="pt-BR"/>
-              </w:rPr>
-              <w:fldChar w:fldCharType="separate"/>
-            </w:r>
-            <w:proofErr w:type="gramStart"/>
-            <w:r>
-              <w:rPr>
-                <w:lang w:val="pt-BR"/>
-              </w:rPr>
-              <w:t xml:space="preserve">{{ </w:t>
-            </w:r>
-            <w:proofErr w:type="spellStart"/>
-            <w:r>
-              <w:rPr>
-                <w:lang w:val="pt-BR"/>
-              </w:rPr>
-              <w:t>avaliacao</w:t>
-            </w:r>
-            <w:proofErr w:type="gramEnd"/>
-            <w:r>
-              <w:rPr>
-                <w:lang w:val="pt-BR"/>
-              </w:rPr>
-              <w:t>_geral</w:t>
-            </w:r>
-            <w:proofErr w:type="spellEnd"/>
-            <w:r>
-              <w:rPr>
-                <w:lang w:val="pt-BR"/>
-              </w:rPr>
-              <w:t xml:space="preserve"> }}</w:t>
+              <w:t xml:space="preserve">{{ gestor_telefone }}AVALIAÇÃO GERAL DO ALUNOQuais foram as principais contribuições da sua formação acadêmica para a realização das suas atividades profissionais desenvolvidas? Comente. FORMTEXT {{ avaliacao_geral }}</w:t>
             </w:r>
             <w:r>
               <w:rPr>
@@ -2189,20 +1780,7 @@
               <w:rPr>
                 <w:lang w:val="pt-BR"/>
               </w:rPr>
-              <w:t xml:space="preserve">{{ </w:t>
-            </w:r>
-            <w:r>
-              <w:t>competencias</w:t>
-            </w:r>
-            <w:proofErr w:type="gramEnd"/>
-            <w:r>
-              <w:t>_desenvolvidas</w:t>
-            </w:r>
-            <w:r>
-              <w:rPr>
-                <w:lang w:val="pt-BR"/>
-              </w:rPr>
-              <w:t xml:space="preserve"> }}</w:t>
+              <w:t xml:space="preserve">{{ competencias_desenvolvidas }}</w:t>
             </w:r>
             <w:r>
               <w:rPr>
@@ -2381,31 +1959,7 @@
               <w:rPr>
                 <w:lang w:val="pt-BR"/>
               </w:rPr>
-              <w:t xml:space="preserve">{{ </w:t>
-            </w:r>
-            <w:proofErr w:type="spellStart"/>
-            <w:r>
-              <w:rPr>
-                <w:lang w:val="pt-BR"/>
-              </w:rPr>
-              <w:t>competencias</w:t>
-            </w:r>
-            <w:proofErr w:type="spellEnd"/>
-            <w:proofErr w:type="gramEnd"/>
-            <w:r>
-              <w:rPr>
-                <w:lang w:val="pt-BR"/>
-              </w:rPr>
-              <w:t>_</w:t>
-            </w:r>
-            <w:r>
-              <w:t>futuras</w:t>
-            </w:r>
-            <w:r>
-              <w:rPr>
-                <w:lang w:val="pt-BR"/>
-              </w:rPr>
-              <w:t xml:space="preserve"> }}</w:t>
+              <w:t xml:space="preserve">{{ competencias_futuras }}</w:t>
             </w:r>
             <w:r>
               <w:rPr>
@@ -2667,11 +2221,7 @@
             </w:r>
             <w:proofErr w:type="gramStart"/>
             <w:r>
-              <w:t>{{ data</w:t>
-            </w:r>
-            <w:proofErr w:type="gramEnd"/>
-            <w:r>
-              <w:t xml:space="preserve"> }}</w:t>
+              <w:t>{{ data }}</w:t>
             </w:r>
             <w:r>
               <w:rPr>

</xml_diff>